<commit_message>
feat: completar Fase 2 analisis recomendacion y features
</commit_message>
<xml_diff>
--- a/evidence/fase2/Evidencias_Fase_2.docx
+++ b/evidence/fase2/Evidencias_Fase_2.docx
@@ -223,21 +223,7 @@
         <w:rPr>
           <w:lang w:val="es-GT"/>
         </w:rPr>
-        <w:t xml:space="preserve">Julio Javier Robles </w:t>
-      </w:r>
-      <w:proofErr w:type="spellStart"/>
-      <w:r>
-        <w:rPr>
-          <w:lang w:val="es-GT"/>
-        </w:rPr>
-        <w:t>Garcia</w:t>
-      </w:r>
-      <w:proofErr w:type="spellEnd"/>
-      <w:r>
-        <w:rPr>
-          <w:lang w:val="es-GT"/>
-        </w:rPr>
-        <w:t xml:space="preserve"> - 1248823</w:t>
+        <w:t>Julio Javier Robles Garcia - 1248823</w:t>
       </w:r>
     </w:p>
     <w:p>
@@ -251,21 +237,7 @@
         <w:rPr>
           <w:lang w:val="es-GT"/>
         </w:rPr>
-        <w:t xml:space="preserve">Ana Lucia </w:t>
-      </w:r>
-      <w:proofErr w:type="spellStart"/>
-      <w:r>
-        <w:rPr>
-          <w:lang w:val="es-GT"/>
-        </w:rPr>
-        <w:t>Chavez</w:t>
-      </w:r>
-      <w:proofErr w:type="spellEnd"/>
-      <w:r>
-        <w:rPr>
-          <w:lang w:val="es-GT"/>
-        </w:rPr>
-        <w:t xml:space="preserve"> Penagos - 1067423</w:t>
+        <w:t>Ana Lucia Chavez Penagos - 1067423</w:t>
       </w:r>
     </w:p>
     <w:p>
@@ -279,31 +251,7 @@
         <w:rPr>
           <w:lang w:val="es-GT"/>
         </w:rPr>
-        <w:t xml:space="preserve">Guatemala, </w:t>
-      </w:r>
-      <w:r>
-        <w:rPr>
-          <w:lang w:val="es-GT"/>
-        </w:rPr>
-        <w:t>12</w:t>
-      </w:r>
-      <w:r>
-        <w:rPr>
-          <w:lang w:val="es-GT"/>
-        </w:rPr>
-        <w:t xml:space="preserve"> de </w:t>
-      </w:r>
-      <w:r>
-        <w:rPr>
-          <w:lang w:val="es-GT"/>
-        </w:rPr>
-        <w:t xml:space="preserve">octubre </w:t>
-      </w:r>
-      <w:r>
-        <w:rPr>
-          <w:lang w:val="es-GT"/>
-        </w:rPr>
-        <w:t>de 2026</w:t>
+        <w:t>Guatemala, 12 de octubre de 2026</w:t>
       </w:r>
     </w:p>
     <w:p>
@@ -362,6 +310,7 @@
         <w:rPr>
           <w:b/>
           <w:bCs/>
+          <w:noProof/>
           <w:lang w:val="es-GT"/>
         </w:rPr>
         <w:drawing>
@@ -415,31 +364,22 @@
           <w:bCs/>
           <w:lang w:val="es-GT"/>
         </w:rPr>
-        <w:t xml:space="preserve">Captura 2 – Creación de las vistas analíticas Gold para </w:t>
-      </w:r>
-      <w:proofErr w:type="spellStart"/>
-      <w:r>
-        <w:rPr>
-          <w:b/>
-          <w:bCs/>
-          <w:lang w:val="es-GT"/>
-        </w:rPr>
-        <w:t>Tableau</w:t>
-      </w:r>
-      <w:proofErr w:type="spellEnd"/>
-    </w:p>
-    <w:p>
-      <w:pPr>
-        <w:rPr>
-          <w:b/>
-          <w:bCs/>
-          <w:lang w:val="es-GT"/>
-        </w:rPr>
-      </w:pPr>
-      <w:r>
-        <w:rPr>
-          <w:b/>
-          <w:bCs/>
+        <w:t>Captura 2 – Creación de las vistas analíticas Gold para Tableau</w:t>
+      </w:r>
+    </w:p>
+    <w:p>
+      <w:pPr>
+        <w:rPr>
+          <w:b/>
+          <w:bCs/>
+          <w:lang w:val="es-GT"/>
+        </w:rPr>
+      </w:pPr>
+      <w:r>
+        <w:rPr>
+          <w:b/>
+          <w:bCs/>
+          <w:noProof/>
           <w:lang w:val="es-GT"/>
         </w:rPr>
         <w:drawing>
@@ -511,25 +451,7 @@
           <w:lang w:val="es-GT"/>
         </w:rPr>
         <w:lastRenderedPageBreak/>
-        <w:t xml:space="preserve">Captura 3 – Conexión de </w:t>
-      </w:r>
-      <w:proofErr w:type="spellStart"/>
-      <w:r>
-        <w:rPr>
-          <w:b/>
-          <w:bCs/>
-          <w:lang w:val="es-GT"/>
-        </w:rPr>
-        <w:t>Tableau</w:t>
-      </w:r>
-      <w:proofErr w:type="spellEnd"/>
-      <w:r>
-        <w:rPr>
-          <w:b/>
-          <w:bCs/>
-          <w:lang w:val="es-GT"/>
-        </w:rPr>
-        <w:t xml:space="preserve"> Desktop a la capa Gold</w:t>
+        <w:t>Captura 3 – Conexión de Tableau Desktop a la capa Gold</w:t>
       </w:r>
     </w:p>
     <w:p>
@@ -545,6 +467,7 @@
         <w:rPr>
           <w:b/>
           <w:bCs/>
+          <w:noProof/>
           <w:lang w:val="es-GT"/>
         </w:rPr>
         <w:drawing>
@@ -614,6 +537,7 @@
         <w:rPr>
           <w:b/>
           <w:bCs/>
+          <w:noProof/>
           <w:lang w:val="es-GT"/>
         </w:rPr>
         <w:drawing>
@@ -692,6 +616,7 @@
         <w:rPr>
           <w:b/>
           <w:bCs/>
+          <w:noProof/>
           <w:lang w:val="es-GT"/>
         </w:rPr>
         <w:drawing>
@@ -760,6 +685,7 @@
         <w:rPr>
           <w:b/>
           <w:bCs/>
+          <w:noProof/>
           <w:lang w:val="es-GT"/>
         </w:rPr>
         <w:drawing>
@@ -847,6 +773,7 @@
         <w:rPr>
           <w:b/>
           <w:bCs/>
+          <w:noProof/>
           <w:lang w:val="es-GT"/>
         </w:rPr>
         <w:drawing>
@@ -915,6 +842,7 @@
         <w:rPr>
           <w:b/>
           <w:bCs/>
+          <w:noProof/>
           <w:lang w:val="es-GT"/>
         </w:rPr>
         <w:drawing>
@@ -984,9 +912,9 @@
         <w:rPr>
           <w:b/>
           <w:bCs/>
-          <w:lang w:val="es-GT"/>
-        </w:rPr>
-        <w:lastRenderedPageBreak/>
+          <w:noProof/>
+          <w:lang w:val="es-GT"/>
+        </w:rPr>
         <w:drawing>
           <wp:inline distT="0" distB="0" distL="0" distR="0" wp14:anchorId="68109622" wp14:editId="5F5C9102">
             <wp:extent cx="3664138" cy="3200564"/>
@@ -1023,16 +951,26 @@
           </wp:inline>
         </w:drawing>
       </w:r>
-      <w:r>
-        <w:rPr>
-          <w:b/>
-          <w:bCs/>
+    </w:p>
+    <w:p>
+      <w:pPr>
+        <w:rPr>
+          <w:b/>
+          <w:bCs/>
+          <w:lang w:val="es-GT"/>
+        </w:rPr>
+      </w:pPr>
+      <w:r>
+        <w:rPr>
+          <w:b/>
+          <w:bCs/>
+          <w:noProof/>
           <w:lang w:val="es-GT"/>
         </w:rPr>
         <w:drawing>
-          <wp:inline distT="0" distB="0" distL="0" distR="0" wp14:anchorId="390DC78C" wp14:editId="5B018ED8">
-            <wp:extent cx="5943600" cy="3008630"/>
-            <wp:effectExtent l="0" t="0" r="0" b="1270"/>
+          <wp:inline distT="0" distB="0" distL="0" distR="0" wp14:anchorId="390DC78C" wp14:editId="7C7755D2">
+            <wp:extent cx="5670550" cy="2870413"/>
+            <wp:effectExtent l="0" t="0" r="6350" b="6350"/>
             <wp:docPr id="444256439" name="Picture 1"/>
             <wp:cNvGraphicFramePr>
               <a:graphicFrameLocks xmlns:a="http://schemas.openxmlformats.org/drawingml/2006/main" noChangeAspect="1"/>
@@ -1053,7 +991,7 @@
                   <pic:spPr>
                     <a:xfrm>
                       <a:off x="0" y="0"/>
-                      <a:ext cx="5943600" cy="3008630"/>
+                      <a:ext cx="5674650" cy="2872488"/>
                     </a:xfrm>
                     <a:prstGeom prst="rect">
                       <a:avLst/>
@@ -1065,10 +1003,20 @@
           </wp:inline>
         </w:drawing>
       </w:r>
-      <w:r>
-        <w:rPr>
-          <w:b/>
-          <w:bCs/>
+    </w:p>
+    <w:p>
+      <w:pPr>
+        <w:rPr>
+          <w:b/>
+          <w:bCs/>
+          <w:lang w:val="es-GT"/>
+        </w:rPr>
+      </w:pPr>
+      <w:r>
+        <w:rPr>
+          <w:b/>
+          <w:bCs/>
+          <w:noProof/>
           <w:lang w:val="es-GT"/>
         </w:rPr>
         <w:lastRenderedPageBreak/>
@@ -1123,38 +1071,26 @@
           <w:bCs/>
           <w:lang w:val="es-GT"/>
         </w:rPr>
-        <w:t xml:space="preserve">Captura 10 – Registro de rendimiento del tablero </w:t>
-      </w:r>
-      <w:proofErr w:type="spellStart"/>
-      <w:r>
-        <w:rPr>
-          <w:b/>
-          <w:bCs/>
-          <w:lang w:val="es-GT"/>
-        </w:rPr>
-        <w:t>Tableau</w:t>
-      </w:r>
-      <w:proofErr w:type="spellEnd"/>
-    </w:p>
-    <w:p>
-      <w:pPr>
-        <w:rPr>
-          <w:b/>
-          <w:bCs/>
-          <w:lang w:val="es-GT"/>
-        </w:rPr>
-      </w:pPr>
-      <w:r>
-        <w:rPr>
-          <w:b/>
-          <w:bCs/>
-          <w:lang w:val="es-GT"/>
-        </w:rPr>
-        <w:lastRenderedPageBreak/>
+        <w:t>Captura 10 – Registro de rendimiento del tablero Tableau</w:t>
+      </w:r>
+    </w:p>
+    <w:p>
+      <w:pPr>
+        <w:rPr>
+          <w:lang w:val="es-GT"/>
+        </w:rPr>
+      </w:pPr>
+      <w:r>
+        <w:rPr>
+          <w:b/>
+          <w:bCs/>
+          <w:noProof/>
+          <w:lang w:val="es-GT"/>
+        </w:rPr>
         <w:drawing>
-          <wp:inline distT="0" distB="0" distL="0" distR="0" wp14:anchorId="75967DCE" wp14:editId="63440B5F">
-            <wp:extent cx="5943600" cy="4745990"/>
-            <wp:effectExtent l="0" t="0" r="0" b="0"/>
+          <wp:inline distT="0" distB="0" distL="0" distR="0" wp14:anchorId="75967DCE" wp14:editId="562F53CE">
+            <wp:extent cx="5556250" cy="4436689"/>
+            <wp:effectExtent l="0" t="0" r="6350" b="2540"/>
             <wp:docPr id="1635557981" name="Picture 1"/>
             <wp:cNvGraphicFramePr>
               <a:graphicFrameLocks xmlns:a="http://schemas.openxmlformats.org/drawingml/2006/main" noChangeAspect="1"/>
@@ -1175,7 +1111,7 @@
                   <pic:spPr>
                     <a:xfrm>
                       <a:off x="0" y="0"/>
-                      <a:ext cx="5943600" cy="4745990"/>
+                      <a:ext cx="5556666" cy="4437022"/>
                     </a:xfrm>
                     <a:prstGeom prst="rect">
                       <a:avLst/>
@@ -1196,40 +1132,134 @@
           <w:lang w:val="es-GT"/>
         </w:rPr>
       </w:pPr>
-    </w:p>
-    <w:p>
-      <w:pPr>
-        <w:rPr>
-          <w:b/>
-          <w:bCs/>
-          <w:lang w:val="es-GT"/>
-        </w:rPr>
-      </w:pPr>
-    </w:p>
-    <w:p>
-      <w:pPr>
-        <w:rPr>
-          <w:b/>
-          <w:bCs/>
-          <w:lang w:val="es-GT"/>
-        </w:rPr>
-      </w:pPr>
-    </w:p>
-    <w:p>
-      <w:pPr>
-        <w:rPr>
-          <w:b/>
-          <w:bCs/>
-          <w:lang w:val="es-GT"/>
-        </w:rPr>
-      </w:pPr>
-    </w:p>
-    <w:p>
-      <w:pPr>
-        <w:rPr>
-          <w:lang w:val="es-GT"/>
-        </w:rPr>
-      </w:pPr>
+      <w:r>
+        <w:rPr>
+          <w:b/>
+          <w:bCs/>
+          <w:lang w:val="es-GT"/>
+        </w:rPr>
+        <w:lastRenderedPageBreak/>
+        <w:t>Captura 11 – Validación dbt de la tabla de features</w:t>
+      </w:r>
+    </w:p>
+    <w:p>
+      <w:pPr>
+        <w:rPr>
+          <w:b/>
+          <w:bCs/>
+          <w:lang w:val="es-GT"/>
+        </w:rPr>
+      </w:pPr>
+      <w:r>
+        <w:rPr>
+          <w:b/>
+          <w:bCs/>
+          <w:lang w:val="es-GT"/>
+        </w:rPr>
+        <w:drawing>
+          <wp:inline distT="0" distB="0" distL="0" distR="0" wp14:anchorId="577B7523" wp14:editId="42E1DA56">
+            <wp:extent cx="5943600" cy="3211830"/>
+            <wp:effectExtent l="0" t="0" r="0" b="7620"/>
+            <wp:docPr id="165422024" name="Picture 1"/>
+            <wp:cNvGraphicFramePr>
+              <a:graphicFrameLocks xmlns:a="http://schemas.openxmlformats.org/drawingml/2006/main" noChangeAspect="1"/>
+            </wp:cNvGraphicFramePr>
+            <a:graphic xmlns:a="http://schemas.openxmlformats.org/drawingml/2006/main">
+              <a:graphicData uri="http://schemas.openxmlformats.org/drawingml/2006/picture">
+                <pic:pic xmlns:pic="http://schemas.openxmlformats.org/drawingml/2006/picture">
+                  <pic:nvPicPr>
+                    <pic:cNvPr id="165422024" name=""/>
+                    <pic:cNvPicPr/>
+                  </pic:nvPicPr>
+                  <pic:blipFill>
+                    <a:blip r:embed="rId16"/>
+                    <a:stretch>
+                      <a:fillRect/>
+                    </a:stretch>
+                  </pic:blipFill>
+                  <pic:spPr>
+                    <a:xfrm>
+                      <a:off x="0" y="0"/>
+                      <a:ext cx="5943600" cy="3211830"/>
+                    </a:xfrm>
+                    <a:prstGeom prst="rect">
+                      <a:avLst/>
+                    </a:prstGeom>
+                  </pic:spPr>
+                </pic:pic>
+              </a:graphicData>
+            </a:graphic>
+          </wp:inline>
+        </w:drawing>
+      </w:r>
+    </w:p>
+    <w:p>
+      <w:pPr>
+        <w:rPr>
+          <w:b/>
+          <w:bCs/>
+          <w:lang w:val="es-GT"/>
+        </w:rPr>
+      </w:pPr>
+      <w:r>
+        <w:rPr>
+          <w:b/>
+          <w:bCs/>
+          <w:lang w:val="es-GT"/>
+        </w:rPr>
+        <w:t>Captura 12 – Resumen de la tabla model-ready por usuario</w:t>
+      </w:r>
+    </w:p>
+    <w:p>
+      <w:pPr>
+        <w:rPr>
+          <w:b/>
+          <w:bCs/>
+          <w:lang w:val="es-GT"/>
+        </w:rPr>
+      </w:pPr>
+      <w:r>
+        <w:rPr>
+          <w:b/>
+          <w:bCs/>
+          <w:lang w:val="es-GT"/>
+        </w:rPr>
+        <w:drawing>
+          <wp:inline distT="0" distB="0" distL="0" distR="0" wp14:anchorId="7FFE3E22" wp14:editId="029AABAB">
+            <wp:extent cx="5943600" cy="1505585"/>
+            <wp:effectExtent l="0" t="0" r="0" b="0"/>
+            <wp:docPr id="2127181148" name="Picture 1"/>
+            <wp:cNvGraphicFramePr>
+              <a:graphicFrameLocks xmlns:a="http://schemas.openxmlformats.org/drawingml/2006/main" noChangeAspect="1"/>
+            </wp:cNvGraphicFramePr>
+            <a:graphic xmlns:a="http://schemas.openxmlformats.org/drawingml/2006/main">
+              <a:graphicData uri="http://schemas.openxmlformats.org/drawingml/2006/picture">
+                <pic:pic xmlns:pic="http://schemas.openxmlformats.org/drawingml/2006/picture">
+                  <pic:nvPicPr>
+                    <pic:cNvPr id="2127181148" name=""/>
+                    <pic:cNvPicPr/>
+                  </pic:nvPicPr>
+                  <pic:blipFill>
+                    <a:blip r:embed="rId17"/>
+                    <a:stretch>
+                      <a:fillRect/>
+                    </a:stretch>
+                  </pic:blipFill>
+                  <pic:spPr>
+                    <a:xfrm>
+                      <a:off x="0" y="0"/>
+                      <a:ext cx="5943600" cy="1505585"/>
+                    </a:xfrm>
+                    <a:prstGeom prst="rect">
+                      <a:avLst/>
+                    </a:prstGeom>
+                  </pic:spPr>
+                </pic:pic>
+              </a:graphicData>
+            </a:graphic>
+          </wp:inline>
+        </w:drawing>
+      </w:r>
     </w:p>
     <w:sectPr>
       <w:pgSz w:w="12240" w:h="15840"/>

</xml_diff>